<commit_message>
Hide contact giving tile when the period has no gifts
</commit_message>
<xml_diff>
--- a/docs/tech-admin/Hope-Sojourns-Style-Guide.docx
+++ b/docs/tech-admin/Hope-Sojourns-Style-Guide.docx
@@ -837,7 +837,7 @@
           <w:color w:val="19322B"/>
           <w:sz w:val="22"/>
         </w:rPr>
-        <w:t>The complete contact record includes a full-width Giving · Past two years card after the profile and ministry relationships. Reuse the existing detail cards, summary list, and responsive table styles. Show the exact date range, total giving, gift count, and gifts newest first with date, amount, payment method, purpose or trip, and notes. On phones, retain the table's field labels. Explain that amounts are before processing fees and donor splits include only the contact's share. An empty history says no giving is recorded for this contact during the period. Hide the section when the viewer lacks finance access. Released to test and production September 23, 2026.</w:t>
+        <w:t>The complete contact record includes a full-width Giving · Past two years card after the profile and ministry relationships. Reuse the existing detail cards, summary list, and responsive table styles. Show the exact date range, total giving, gift count, and gifts newest first with date, amount, payment method, purpose or trip, and notes. On phones, retain the table's field labels. Explain that amounts are before processing fees and donor splits include only the contact's share. Hide the entire card when no gifts fall within the displayed two-year period. Hide the section when the viewer lacks finance access. The giving card was released September 23, 2026; build 2026-09-23.4 includes the empty-card visibility correction.</w:t>
       </w:r>
     </w:p>
     <w:p>
@@ -13711,7 +13711,7 @@
           <w:color w:val="19322B"/>
           <w:sz w:val="22"/>
         </w:rPr>
-        <w:t>September 23, 2026 — Version 4.11: Released the contact record's rolling two-year giving card, totals, responsive gift history, and empty state to both test and production.</w:t>
+        <w:t>September 23, 2026 — Version 4.11: Released the contact giving card to both portals. Build 2026-09-23.4 hides the entire card for contacts with no gifts in the displayed period.</w:t>
       </w:r>
     </w:p>
     <w:tbl>

</xml_diff>

<commit_message>
Make Home financial summary more compact
</commit_message>
<xml_diff>
--- a/docs/tech-admin/Hope-Sojourns-Style-Guide.docx
+++ b/docs/tech-admin/Hope-Sojourns-Style-Guide.docx
@@ -130,7 +130,7 @@
           <w:color w:val="60726B"/>
           <w:sz w:val="20"/>
         </w:rPr>
-        <w:t>Version 4.20</w:t>
+        <w:t>Version 4.21</w:t>
       </w:r>
       <w:r>
         <w:rPr>
@@ -972,6 +972,16 @@
           <w:sz w:val="32"/>
         </w:rPr>
         <w:t>Home financial summary</w:t>
+      </w:r>
+    </w:p>
+    <w:p>
+      <w:r>
+        <w:rPr>
+          <w:rFonts w:ascii="Segoe UI" w:hAnsi="Segoe UI"/>
+          <w:color w:val="19322B"/>
+          <w:sz w:val="22"/>
+        </w:rPr>
+        <w:t>Keep this summary compact: 1.35rem amounts, 0.8rem tile labels, 1.15rem section heading and 0.95rem period headings. Use 0.75rem by 1rem tile padding and 1rem panel padding. Preserve paper and forest-wash surfaces, rounded tiles, visible focus and responsive stacking.</w:t>
       </w:r>
     </w:p>
     <w:p>
@@ -14393,6 +14403,16 @@
           <w:sz w:val="32"/>
         </w:rPr>
         <w:t>Revision history</w:t>
+      </w:r>
+    </w:p>
+    <w:p>
+      <w:r>
+        <w:rPr>
+          <w:rFonts w:ascii="Segoe UI" w:hAnsi="Segoe UI"/>
+          <w:color w:val="19322B"/>
+          <w:sz w:val="22"/>
+        </w:rPr>
+        <w:t>October 2, 2026 — Version 4.21: Reduced Home summary typography and spacing while preserving tiles and colors; local pending release.</w:t>
       </w:r>
     </w:p>
     <w:p>

</xml_diff>